<commit_message>
fix: update Gambar 1 to use Proses2.png and add analysis paragraphs after each image
</commit_message>
<xml_diff>
--- a/Laporan_Analisis_Statistik_Deskriptif.docx
+++ b/Laporan_Analisis_Statistik_Deskriptif.docx
@@ -326,7 +326,7 @@
           </w:tcPr>
           <w:p>
             <w:r>
-              <w:t>Rating kompetisi (1=sangat sedikit kompetisi, 5=sangat kompetitif)</w:t>
+              <w:t>Rating kompetisi (1=sangat sedikit, 5=sangat kompetitif)</w:t>
             </w:r>
           </w:p>
         </w:tc>
@@ -368,7 +368,7 @@
       <w:r>
         <w:drawing>
           <wp:inline xmlns:a="http://schemas.openxmlformats.org/drawingml/2006/main" xmlns:pic="http://schemas.openxmlformats.org/drawingml/2006/picture">
-            <wp:extent cx="5486400" cy="3511995"/>
+            <wp:extent cx="5486400" cy="3542097"/>
             <wp:docPr id="1" name="Picture 1"/>
             <wp:cNvGraphicFramePr>
               <a:graphicFrameLocks noChangeAspect="1"/>
@@ -377,7 +377,7 @@
               <a:graphicData uri="http://schemas.openxmlformats.org/drawingml/2006/picture">
                 <pic:pic>
                   <pic:nvPicPr>
-                    <pic:cNvPr id="0" name="Proses.png"/>
+                    <pic:cNvPr id="0" name="Proses2.png"/>
                     <pic:cNvPicPr/>
                   </pic:nvPicPr>
                   <pic:blipFill>
@@ -389,7 +389,7 @@
                   <pic:spPr>
                     <a:xfrm>
                       <a:off x="0" y="0"/>
-                      <a:ext cx="5486400" cy="3511995"/>
+                      <a:ext cx="5486400" cy="3542097"/>
                     </a:xfrm>
                     <a:prstGeom prst="rect"/>
                   </pic:spPr>
@@ -406,6 +406,11 @@
       </w:pPr>
       <w:r>
         <w:t>Gambar 1: Desain Proses di RapidMiner AI Studio</w:t>
+      </w:r>
+    </w:p>
+    <w:p>
+      <w:r>
+        <w:t>Proses ini sangat sederhana: data dibaca dari file Excel kemudian langsung diproses oleh operator Statistics untuk menghasilkan statistik deskriptif dari seluruh atribut.</w:t>
       </w:r>
     </w:p>
     <w:p>
@@ -482,6 +487,11 @@
       </w:r>
     </w:p>
     <w:p>
+      <w:r>
+        <w:t>Analisis: Tabel statistik deskriptif menunjukkan ringkasan data untuk setiap atribut, termasuk jumlah data, rata-rata, standar deviasi, nilai minimum dan maksimum. Dari tabel ini terlihat bahwa data memiliki variasi yang cukup besar pada atribut Gross Sales dan Gross Profit, sementara Percent Gross Profit dan Competitive Rating memiliki rentang nilai yang lebih sempit.</w:t>
+      </w:r>
+    </w:p>
+    <w:p>
       <w:pPr>
         <w:pStyle w:val="Heading2"/>
       </w:pPr>
@@ -539,6 +549,11 @@
       </w:pPr>
       <w:r>
         <w:t>Gambar 3: Visualisasi Keseluruhan Data</w:t>
+      </w:r>
+    </w:p>
+    <w:p>
+      <w:r>
+        <w:t>Analisis: Visualisasi keseluruhan memberikan gambaran umum tentang distribusi dan hubungan antar atribut dalam dataset. Dari visualisasi ini dapat dilihat pola sebaran data secara menyeluruh untuk semua variabel yang ada.</w:t>
       </w:r>
     </w:p>
     <w:p>
@@ -607,6 +622,11 @@
       </w:r>
     </w:p>
     <w:p>
+      <w:r>
+        <w:t>Analisis: Atribut Customer merupakan identitas unik untuk setiap pelanggan (1-60). Distribusi menunjukkan bahwa setiap pelanggan memiliki satu record data, sehingga tidak ada duplikasi dalam dataset.</w:t>
+      </w:r>
+    </w:p>
+    <w:p>
       <w:pPr>
         <w:pStyle w:val="Heading2"/>
       </w:pPr>
@@ -664,6 +684,11 @@
       </w:pPr>
       <w:r>
         <w:t>Gambar 5: Distribusi Gross Sales</w:t>
+      </w:r>
+    </w:p>
+    <w:p>
+      <w:r>
+        <w:t>Analisis: Distribusi Gross Sales menunjukkan sebaran total penjualan kotor yang berkisar dari 170 hingga 179,101. Sebagian besar pelanggan memiliki nilai penjualan di bawah rata-rata, dengan beberapa pelanggan memiliki nilai penjualan yang sangat tinggi (outlier).</w:t>
       </w:r>
     </w:p>
     <w:p>
@@ -732,6 +757,11 @@
       </w:r>
     </w:p>
     <w:p>
+      <w:r>
+        <w:t>Analisis: Distribusi Gross Profit menunjukkan sebaran laba kotor yang berkisar dari 40.6 hingga 25,379.34. Pola distribusi serupa dengan Gross Sales, dimana mayoritas pelanggan menghasilkan laba kotor yang relatif rendah, dengan beberapa pelanggan yang sangat menguntungkan.</w:t>
+      </w:r>
+    </w:p>
+    <w:p>
       <w:pPr>
         <w:pStyle w:val="Heading2"/>
       </w:pPr>
@@ -789,6 +819,11 @@
       </w:pPr>
       <w:r>
         <w:t>Gambar 7: Distribusi Industry Code</w:t>
+      </w:r>
+    </w:p>
+    <w:p>
+      <w:r>
+        <w:t>Analisis: Industry Code memiliki nilai dari 1 hingga 7, merepresentasikan 7 jenis industri berbeda. Distribusi menunjukkan bagaimana pelanggan tersebar di berbagai sektor industri, yang dapat membantu memahami segmentasi pasar.</w:t>
       </w:r>
     </w:p>
     <w:p>
@@ -857,6 +892,11 @@
       </w:r>
     </w:p>
     <w:p>
+      <w:r>
+        <w:t>Analisis: Percent Gross Profit berkisar dari 0.03 (3%) hingga 0.60 (60%), menunjukkan persentase laba kotor dari penjualan. Mayoritas pelanggan memiliki margin laba antara 10-25%, yang mengindikasikan tingkat profitabilitas yang bervariasi.</w:t>
+      </w:r>
+    </w:p>
+    <w:p>
       <w:pPr>
         <w:pStyle w:val="Heading1"/>
       </w:pPr>
@@ -876,12 +916,12 @@
     </w:p>
     <w:p>
       <w:r>
-        <w:t>2. Statistik deskriptif menunjukkan karakteristik utama dari setiap atribut, termasuk nilai rata-rata, standar deviasi, minimum, dan maksimum.</w:t>
+        <w:t>2. Statistik deskriptif menunjukkan variasi yang besar pada atribut Gross Sales dan Gross Profit, sementara atribut lainnya memiliki rentang nilai yang lebih terbatas.</w:t>
       </w:r>
     </w:p>
     <w:p>
       <w:r>
-        <w:t>3. Visualisasi distribusi setiap atribut membantu memahami sebaran data dan mengidentifikasi pola-pola dalam data penjualan.</w:t>
+        <w:t>3. Visualisasi distribusi menunjukkan bahwa sebagian besar pelanggan memiliki nilai penjualan dan laba di bawah rata-rata, dengan beberapa pelanggan yang menonjol sebagai outlier.</w:t>
       </w:r>
     </w:p>
     <w:sectPr>

</xml_diff>